<commit_message>
refactor: update assessment forms and presentation for Lesson 13 with improved time conversion questions and enhanced layout for timeline problems
</commit_message>
<xml_diff>
--- a/Units/Maths/Maths_Unit_2/Lesson_13/Assessment_Forms.docx
+++ b/Units/Maths/Maths_Unit_2/Lesson_13/Assessment_Forms.docx
@@ -75,7 +75,7 @@
     </w:p>
     <w:p>
       <w:r>
-        <w:t xml:space="preserve">A) 07:15</w:t>
+        <w:t xml:space="preserve">A) 1715</w:t>
       </w:r>
     </w:p>
     <w:p>
@@ -90,7 +90,7 @@
     </w:p>
     <w:p>
       <w:r>
-        <w:t xml:space="preserve">D) 715</w:t>
+        <w:t xml:space="preserve">D) 0700</w:t>
       </w:r>
     </w:p>
     <w:p>
@@ -134,7 +134,7 @@
     </w:p>
     <w:p>
       <w:r>
-        <w:t xml:space="preserve">B) 18:30 p.m.</w:t>
+        <w:t xml:space="preserve">B) 8:30 p.m.</w:t>
       </w:r>
     </w:p>
     <w:p>
@@ -144,7 +144,7 @@
     </w:p>
     <w:p>
       <w:r>
-        <w:t xml:space="preserve">D) 8:30 p.m.</w:t>
+        <w:t xml:space="preserve">D) 6:00 p.m.</w:t>
       </w:r>
     </w:p>
     <w:p>
@@ -193,7 +193,7 @@
     </w:p>
     <w:p>
       <w:r>
-        <w:t xml:space="preserve">C) 23:20</w:t>
+        <w:t xml:space="preserve">C) 2120</w:t>
       </w:r>
     </w:p>
     <w:p>
@@ -252,7 +252,7 @@
     </w:p>
     <w:p>
       <w:r>
-        <w:t xml:space="preserve">D) 0:15 a.m.</w:t>
+        <w:t xml:space="preserve">D) 11:15 p.m.</w:t>
       </w:r>
     </w:p>
     <w:p>
@@ -301,12 +301,12 @@
     </w:p>
     <w:p>
       <w:r>
-        <w:t xml:space="preserve">C) 2440</w:t>
-      </w:r>
-    </w:p>
-    <w:p>
-      <w:r>
-        <w:t xml:space="preserve">D) 12:40</w:t>
+        <w:t xml:space="preserve">C) 1440</w:t>
+      </w:r>
+    </w:p>
+    <w:p>
+      <w:r>
+        <w:t xml:space="preserve">D) 0240</w:t>
       </w:r>
     </w:p>
     <w:p>

</xml_diff>